<commit_message>
added an additional feature - Injury Mechanism as a predictor
</commit_message>
<xml_diff>
--- a/docs/CPSA-Data Preparation and Modeling Report.docx
+++ b/docs/CPSA-Data Preparation and Modeling Report.docx
@@ -19803,8 +19803,16 @@
         <w:rPr>
           <w:rFonts w:asciiTheme="minorHAnsi" w:hAnsiTheme="minorHAnsi"/>
         </w:rPr>
-        <w:t xml:space="preserve">Derive this feature from the Treatment Date Feature </w:t>
-      </w:r>
+        <w:t>Derive this feature from the Treatment Date Feature</w:t>
+      </w:r>
+    </w:p>
+    <w:p>
+      <w:pPr>
+        <w:ind w:left="1530" w:firstLine="720"/>
+        <w:rPr>
+          <w:rFonts w:asciiTheme="minorHAnsi" w:hAnsiTheme="minorHAnsi"/>
+        </w:rPr>
+      </w:pPr>
     </w:p>
     <w:p>
       <w:pPr>
@@ -19864,15 +19872,34 @@
         <w:rPr>
           <w:rFonts w:asciiTheme="minorHAnsi" w:hAnsiTheme="minorHAnsi"/>
         </w:rPr>
-        <w:t>Product_1</w:t>
-      </w:r>
-      <w:r>
-        <w:rPr>
-          <w:rFonts w:asciiTheme="minorHAnsi" w:hAnsiTheme="minorHAnsi"/>
-        </w:rPr>
-        <w:t>:</w:t>
-      </w:r>
-    </w:p>
+        <w:t>Categorical Features</w:t>
+      </w:r>
+    </w:p>
+    <w:p>
+      <w:pPr>
+        <w:pStyle w:val="Heading4"/>
+        <w:ind w:left="2160"/>
+        <w:rPr>
+          <w:rFonts w:asciiTheme="minorHAnsi" w:hAnsiTheme="minorHAnsi"/>
+        </w:rPr>
+      </w:pPr>
+    </w:p>
+    <w:p>
+      <w:pPr>
+        <w:pStyle w:val="Heading5"/>
+        <w:ind w:left="2160"/>
+        <w:rPr>
+          <w:rFonts w:asciiTheme="minorHAnsi" w:hAnsiTheme="minorHAnsi"/>
+        </w:rPr>
+      </w:pPr>
+      <w:r>
+        <w:rPr>
+          <w:rFonts w:asciiTheme="minorHAnsi" w:hAnsiTheme="minorHAnsi"/>
+        </w:rPr>
+        <w:t>Product_1:</w:t>
+      </w:r>
+    </w:p>
+    <w:p/>
     <w:p>
       <w:pPr>
         <w:spacing w:line="360" w:lineRule="auto"/>
@@ -19953,6 +19980,51 @@
         </w:rPr>
         <w:t>). To strictly prohibit target leakage, the encoding probabilities were fitted exclusively on the Training partition, utilizing statistical smoothing to penalize low-frequency categories, before being mapped to the Validation and Hold-Out datasets.</w:t>
       </w:r>
+    </w:p>
+    <w:p>
+      <w:pPr>
+        <w:spacing w:line="360" w:lineRule="auto"/>
+        <w:ind w:left="2160"/>
+        <w:rPr>
+          <w:rFonts w:asciiTheme="minorHAnsi" w:hAnsiTheme="minorHAnsi"/>
+        </w:rPr>
+      </w:pPr>
+    </w:p>
+    <w:p>
+      <w:pPr>
+        <w:pStyle w:val="Heading4"/>
+        <w:ind w:left="2160"/>
+        <w:rPr>
+          <w:rFonts w:asciiTheme="minorHAnsi" w:hAnsiTheme="minorHAnsi"/>
+        </w:rPr>
+      </w:pPr>
+      <w:r>
+        <w:rPr>
+          <w:rFonts w:asciiTheme="minorHAnsi" w:hAnsiTheme="minorHAnsi"/>
+        </w:rPr>
+        <w:t>Diagnosis, Body Part, Location, Body Part 2</w:t>
+      </w:r>
+    </w:p>
+    <w:p>
+      <w:r>
+        <w:tab/>
+      </w:r>
+      <w:r>
+        <w:tab/>
+      </w:r>
+      <w:r>
+        <w:tab/>
+        <w:t xml:space="preserve">We applied One-Hot Encoding for </w:t>
+      </w:r>
+    </w:p>
+    <w:p>
+      <w:pPr>
+        <w:spacing w:line="360" w:lineRule="auto"/>
+        <w:ind w:left="2160"/>
+        <w:rPr>
+          <w:rFonts w:asciiTheme="minorHAnsi" w:hAnsiTheme="minorHAnsi"/>
+        </w:rPr>
+      </w:pPr>
     </w:p>
     <w:p>
       <w:pPr>
@@ -19979,6 +20051,7 @@
         <w:rPr>
           <w:rFonts w:asciiTheme="minorHAnsi" w:hAnsiTheme="minorHAnsi"/>
         </w:rPr>
+        <w:lastRenderedPageBreak/>
         <w:t>Temporal Features</w:t>
       </w:r>
       <w:bookmarkEnd w:id="17"/>
@@ -20109,10 +20182,38 @@
         <w:rPr>
           <w:rFonts w:asciiTheme="minorHAnsi" w:hAnsiTheme="minorHAnsi"/>
         </w:rPr>
-        <w:lastRenderedPageBreak/>
         <w:t>Domain Specific Features</w:t>
       </w:r>
       <w:bookmarkEnd w:id="18"/>
+    </w:p>
+    <w:p/>
+    <w:p>
+      <w:pPr>
+        <w:ind w:left="2160"/>
+      </w:pPr>
+    </w:p>
+    <w:p>
+      <w:pPr>
+        <w:pStyle w:val="Heading5"/>
+        <w:ind w:left="2160"/>
+        <w:rPr>
+          <w:rFonts w:asciiTheme="minorHAnsi" w:hAnsiTheme="minorHAnsi"/>
+        </w:rPr>
+      </w:pPr>
+      <w:r>
+        <w:rPr>
+          <w:rFonts w:asciiTheme="minorHAnsi" w:hAnsiTheme="minorHAnsi"/>
+        </w:rPr>
+        <w:t>EMS/Severity Escalation, Safety Equipment Utilization, Third-Party Intervention, Height Risk, and Water Risk</w:t>
+      </w:r>
+    </w:p>
+    <w:p>
+      <w:pPr>
+        <w:ind w:left="2160"/>
+        <w:rPr>
+          <w:rFonts w:asciiTheme="minorHAnsi" w:hAnsiTheme="minorHAnsi"/>
+        </w:rPr>
+      </w:pPr>
     </w:p>
     <w:p>
       <w:pPr>
@@ -20127,6 +20228,99 @@
           <w:rFonts w:asciiTheme="minorHAnsi" w:hAnsiTheme="minorHAnsi"/>
         </w:rPr>
         <w:t>To augment the predictive capacity of the baseline categorical variables, rule-based Natural Language Processing (NLP) was applied to the unstructured clinical narratives. A series of deterministic regular expression (Regex) algorithms were developed to extract high-value contextual vectors that are historically under-coded in the CPSC taxonomy. This yielded five distinct binary features: EMS/Severity Escalation, Safety Equipment Utilization, Third-Party Intervention, Height Risk, and Water Risk. These boolean indicators provide the classification algorithms with critical micro-environmental context necessary for accurately predicting hospitalization probability.</w:t>
+      </w:r>
+    </w:p>
+    <w:p>
+      <w:pPr>
+        <w:spacing w:line="360" w:lineRule="auto"/>
+        <w:ind w:left="2160"/>
+        <w:rPr>
+          <w:rFonts w:asciiTheme="minorHAnsi" w:hAnsiTheme="minorHAnsi"/>
+        </w:rPr>
+      </w:pPr>
+    </w:p>
+    <w:p>
+      <w:pPr>
+        <w:pStyle w:val="Heading5"/>
+        <w:ind w:left="2160"/>
+        <w:rPr>
+          <w:rFonts w:asciiTheme="minorHAnsi" w:hAnsiTheme="minorHAnsi"/>
+        </w:rPr>
+      </w:pPr>
+      <w:r>
+        <w:rPr>
+          <w:rFonts w:asciiTheme="minorHAnsi" w:hAnsiTheme="minorHAnsi"/>
+        </w:rPr>
+        <w:t>Injury Mechanism:</w:t>
+      </w:r>
+    </w:p>
+    <w:p>
+      <w:pPr>
+        <w:spacing w:line="360" w:lineRule="auto"/>
+        <w:ind w:left="2160"/>
+        <w:rPr>
+          <w:rFonts w:asciiTheme="minorHAnsi" w:hAnsiTheme="minorHAnsi"/>
+        </w:rPr>
+      </w:pPr>
+    </w:p>
+    <w:p>
+      <w:pPr>
+        <w:spacing w:line="360" w:lineRule="auto"/>
+        <w:ind w:left="2160"/>
+        <w:rPr>
+          <w:rFonts w:asciiTheme="minorHAnsi" w:hAnsiTheme="minorHAnsi"/>
+        </w:rPr>
+      </w:pPr>
+      <w:r>
+        <w:rPr>
+          <w:rFonts w:asciiTheme="minorHAnsi" w:hAnsiTheme="minorHAnsi"/>
+        </w:rPr>
+        <w:t>T</w:t>
+      </w:r>
+      <w:r>
+        <w:rPr>
+          <w:rFonts w:asciiTheme="minorHAnsi" w:hAnsiTheme="minorHAnsi"/>
+        </w:rPr>
+        <w:t xml:space="preserve">o capture the root behavioral cause of the incidents, a new categorical feature, </w:t>
+      </w:r>
+      <w:proofErr w:type="spellStart"/>
+      <w:r>
+        <w:rPr>
+          <w:rStyle w:val="HTMLCode"/>
+          <w:rFonts w:asciiTheme="minorHAnsi" w:hAnsiTheme="minorHAnsi"/>
+          <w:sz w:val="24"/>
+          <w:szCs w:val="24"/>
+        </w:rPr>
+        <w:t>Injury_Mechanism</w:t>
+      </w:r>
+      <w:proofErr w:type="spellEnd"/>
+      <w:r>
+        <w:rPr>
+          <w:rFonts w:asciiTheme="minorHAnsi" w:hAnsiTheme="minorHAnsi"/>
+        </w:rPr>
+        <w:t xml:space="preserve">, was engineered from the unstructured </w:t>
+      </w:r>
+      <w:r>
+        <w:rPr>
+          <w:rStyle w:val="HTMLCode"/>
+          <w:rFonts w:asciiTheme="minorHAnsi" w:hAnsiTheme="minorHAnsi"/>
+          <w:sz w:val="24"/>
+          <w:szCs w:val="24"/>
+        </w:rPr>
+        <w:t>Narrative</w:t>
+      </w:r>
+      <w:r>
+        <w:rPr>
+          <w:rFonts w:asciiTheme="minorHAnsi" w:hAnsiTheme="minorHAnsi"/>
+        </w:rPr>
+        <w:t xml:space="preserve"> column. A deterministic Regular Expression (Regex) algorithm was deployed to scan the 142-character text </w:t>
+      </w:r>
+      <w:r>
+        <w:rPr>
+          <w:rFonts w:asciiTheme="minorHAnsi" w:hAnsiTheme="minorHAnsi"/>
+        </w:rPr>
+        <w:lastRenderedPageBreak/>
+        <w:t>vectors for standardized keyword groups, effectively categorizing raw clinical text into five distinct quantitative mechanisms (e.g., Fall, Burn, Ingestion). Narratives lacking these specific keyword patterns were binned as 'Other/Unspecified' to maintain dataset dimensionality without introducing speculative bias.</w:t>
       </w:r>
     </w:p>
     <w:p/>
@@ -20157,6 +20351,44 @@
         <w:t xml:space="preserve"> </w:t>
       </w:r>
     </w:p>
+    <w:p>
+      <w:pPr>
+        <w:ind w:left="2160"/>
+      </w:pPr>
+      <w:r>
+        <w:t>True Alcohol</w:t>
+      </w:r>
+    </w:p>
+    <w:p>
+      <w:pPr>
+        <w:ind w:left="2160"/>
+      </w:pPr>
+      <w:r>
+        <w:t>True Drug</w:t>
+      </w:r>
+    </w:p>
+    <w:p>
+      <w:pPr>
+        <w:ind w:left="2160"/>
+      </w:pPr>
+      <w:r>
+        <w:t>Treatment Year</w:t>
+      </w:r>
+    </w:p>
+    <w:p>
+      <w:pPr>
+        <w:ind w:left="2160"/>
+      </w:pPr>
+      <w:r>
+        <w:t>Treatment Month</w:t>
+      </w:r>
+    </w:p>
+    <w:p>
+      <w:pPr>
+        <w:ind w:left="2160"/>
+      </w:pPr>
+    </w:p>
+    <w:p/>
     <w:p>
       <w:pPr>
         <w:rPr>

</xml_diff>